<commit_message>
docs: merge formatted SRS/SDS assets into current markdown exports
Restore eight Figma screenshots from legacy formatted DOCX into docs/assets/figma, embed them in updated SRS/SDS markdown, regenerate DOCX with image support in md_to_docx.py, and remove superseded *_formatted.docx files.

Co-authored-by: Cursor <cursoragent@cursor.com>
</commit_message>
<xml_diff>
--- a/sds/SDS_Agentic_Accessibility_Auditor_v2.0.docx
+++ b/sds/SDS_Agentic_Accessibility_Auditor_v2.0.docx
@@ -501,6 +501,48 @@
           <w:p>
             <w:r>
               <w:t>Rules ownership → Salar + Noor + Ayesha (reviewed by all)</w:t>
+            </w:r>
+          </w:p>
+        </w:tc>
+      </w:tr>
+      <w:tr>
+        <w:tc>
+          <w:tcPr>
+            <w:tcW w:type="dxa" w:w="2160"/>
+          </w:tcPr>
+          <w:p>
+            <w:r>
+              <w:t>**2.5**</w:t>
+            </w:r>
+          </w:p>
+        </w:tc>
+        <w:tc>
+          <w:tcPr>
+            <w:tcW w:type="dxa" w:w="2160"/>
+          </w:tcPr>
+          <w:p>
+            <w:r>
+              <w:t>2026-07-13</w:t>
+            </w:r>
+          </w:p>
+        </w:tc>
+        <w:tc>
+          <w:tcPr>
+            <w:tcW w:type="dxa" w:w="2160"/>
+          </w:tcPr>
+          <w:p>
+            <w:r>
+              <w:t>Noor</w:t>
+            </w:r>
+          </w:p>
+        </w:tc>
+        <w:tc>
+          <w:tcPr>
+            <w:tcW w:type="dxa" w:w="2160"/>
+          </w:tcPr>
+          <w:p>
+            <w:r>
+              <w:t>Figma screenshots restored from formatted DOCX into `docs/assets/figma/`; DOCX export embeds images</w:t>
             </w:r>
           </w:p>
         </w:tc>
@@ -7395,7 +7437,7 @@
     </w:p>
     <w:p>
       <w:r>
-        <w:t xml:space="preserve">Visual source of truth: SRS Appendix F. Screenshots live in </w:t>
+        <w:t xml:space="preserve">Visual source of truth: SRS Appendix F. Screenshots were restored from the legacy formatted DOCX export into </w:t>
       </w:r>
       <w:r>
         <w:rPr>
@@ -7404,7 +7446,7 @@
         <w:t>docs/assets/figma/</w:t>
       </w:r>
       <w:r>
-        <w:t xml:space="preserve"> (same paths as SRS).</w:t>
+        <w:t xml:space="preserve"> and are embedded below for implementation reference.</w:t>
       </w:r>
     </w:p>
     <w:tbl>
@@ -7741,12 +7783,354 @@
     </w:tbl>
     <w:p>
       <w:r>
-        <w:t>![Sign Up and Log In — implementation reference](../docs/assets/figma/figma-01-signup-login.png)</w:t>
+        <w:rPr>
+          <w:i/>
+        </w:rPr>
+        <w:t>Sign Up and Log In — implementation reference</w:t>
       </w:r>
     </w:p>
     <w:p>
       <w:r>
-        <w:t>![Upload and Dashboard — implementation reference](../docs/assets/figma/figma-05-audit-complete-dashboard.png)</w:t>
+        <w:drawing>
+          <wp:inline xmlns:a="http://schemas.openxmlformats.org/drawingml/2006/main" xmlns:pic="http://schemas.openxmlformats.org/drawingml/2006/picture">
+            <wp:extent cx="5486400" cy="2196703"/>
+            <wp:docPr id="1" name="Picture 1"/>
+            <wp:cNvGraphicFramePr>
+              <a:graphicFrameLocks noChangeAspect="1"/>
+            </wp:cNvGraphicFramePr>
+            <a:graphic>
+              <a:graphicData uri="http://schemas.openxmlformats.org/drawingml/2006/picture">
+                <pic:pic>
+                  <pic:nvPicPr>
+                    <pic:cNvPr id="0" name="figma-01-signup-login.png"/>
+                    <pic:cNvPicPr/>
+                  </pic:nvPicPr>
+                  <pic:blipFill>
+                    <a:blip r:embed="rId9"/>
+                    <a:stretch>
+                      <a:fillRect/>
+                    </a:stretch>
+                  </pic:blipFill>
+                  <pic:spPr>
+                    <a:xfrm>
+                      <a:off x="0" y="0"/>
+                      <a:ext cx="5486400" cy="2196703"/>
+                    </a:xfrm>
+                    <a:prstGeom prst="rect"/>
+                  </pic:spPr>
+                </pic:pic>
+              </a:graphicData>
+            </a:graphic>
+          </wp:inline>
+        </w:drawing>
+      </w:r>
+    </w:p>
+    <w:p>
+      <w:r>
+        <w:rPr>
+          <w:i/>
+        </w:rPr>
+        <w:t>Forgot Password and Verify Code — implementation reference</w:t>
+      </w:r>
+    </w:p>
+    <w:p>
+      <w:r>
+        <w:drawing>
+          <wp:inline xmlns:a="http://schemas.openxmlformats.org/drawingml/2006/main" xmlns:pic="http://schemas.openxmlformats.org/drawingml/2006/picture">
+            <wp:extent cx="5486400" cy="2384227"/>
+            <wp:docPr id="2" name="Picture 2"/>
+            <wp:cNvGraphicFramePr>
+              <a:graphicFrameLocks noChangeAspect="1"/>
+            </wp:cNvGraphicFramePr>
+            <a:graphic>
+              <a:graphicData uri="http://schemas.openxmlformats.org/drawingml/2006/picture">
+                <pic:pic>
+                  <pic:nvPicPr>
+                    <pic:cNvPr id="0" name="figma-02-forgot-verify-otp.png"/>
+                    <pic:cNvPicPr/>
+                  </pic:nvPicPr>
+                  <pic:blipFill>
+                    <a:blip r:embed="rId10"/>
+                    <a:stretch>
+                      <a:fillRect/>
+                    </a:stretch>
+                  </pic:blipFill>
+                  <pic:spPr>
+                    <a:xfrm>
+                      <a:off x="0" y="0"/>
+                      <a:ext cx="5486400" cy="2384227"/>
+                    </a:xfrm>
+                    <a:prstGeom prst="rect"/>
+                  </pic:spPr>
+                </pic:pic>
+              </a:graphicData>
+            </a:graphic>
+          </wp:inline>
+        </w:drawing>
+      </w:r>
+    </w:p>
+    <w:p>
+      <w:r>
+        <w:rPr>
+          <w:i/>
+        </w:rPr>
+        <w:t>Set Password and Password Reset Success — implementation reference</w:t>
+      </w:r>
+    </w:p>
+    <w:p>
+      <w:r>
+        <w:drawing>
+          <wp:inline xmlns:a="http://schemas.openxmlformats.org/drawingml/2006/main" xmlns:pic="http://schemas.openxmlformats.org/drawingml/2006/picture">
+            <wp:extent cx="5486400" cy="2218134"/>
+            <wp:docPr id="3" name="Picture 3"/>
+            <wp:cNvGraphicFramePr>
+              <a:graphicFrameLocks noChangeAspect="1"/>
+            </wp:cNvGraphicFramePr>
+            <a:graphic>
+              <a:graphicData uri="http://schemas.openxmlformats.org/drawingml/2006/picture">
+                <pic:pic>
+                  <pic:nvPicPr>
+                    <pic:cNvPr id="0" name="figma-03-reset-password-success.png"/>
+                    <pic:cNvPicPr/>
+                  </pic:nvPicPr>
+                  <pic:blipFill>
+                    <a:blip r:embed="rId11"/>
+                    <a:stretch>
+                      <a:fillRect/>
+                    </a:stretch>
+                  </pic:blipFill>
+                  <pic:spPr>
+                    <a:xfrm>
+                      <a:off x="0" y="0"/>
+                      <a:ext cx="5486400" cy="2218134"/>
+                    </a:xfrm>
+                    <a:prstGeom prst="rect"/>
+                  </pic:spPr>
+                </pic:pic>
+              </a:graphicData>
+            </a:graphic>
+          </wp:inline>
+        </w:drawing>
+      </w:r>
+    </w:p>
+    <w:p>
+      <w:r>
+        <w:rPr>
+          <w:i/>
+        </w:rPr>
+        <w:t>Upload screen — implementation reference</w:t>
+      </w:r>
+    </w:p>
+    <w:p>
+      <w:r>
+        <w:drawing>
+          <wp:inline xmlns:a="http://schemas.openxmlformats.org/drawingml/2006/main" xmlns:pic="http://schemas.openxmlformats.org/drawingml/2006/picture">
+            <wp:extent cx="5486400" cy="7197301"/>
+            <wp:docPr id="4" name="Picture 4"/>
+            <wp:cNvGraphicFramePr>
+              <a:graphicFrameLocks noChangeAspect="1"/>
+            </wp:cNvGraphicFramePr>
+            <a:graphic>
+              <a:graphicData uri="http://schemas.openxmlformats.org/drawingml/2006/picture">
+                <pic:pic>
+                  <pic:nvPicPr>
+                    <pic:cNvPr id="0" name="figma-04-upload-progress-states.png"/>
+                    <pic:cNvPicPr/>
+                  </pic:nvPicPr>
+                  <pic:blipFill>
+                    <a:blip r:embed="rId12"/>
+                    <a:stretch>
+                      <a:fillRect/>
+                    </a:stretch>
+                  </pic:blipFill>
+                  <pic:spPr>
+                    <a:xfrm>
+                      <a:off x="0" y="0"/>
+                      <a:ext cx="5486400" cy="7197301"/>
+                    </a:xfrm>
+                    <a:prstGeom prst="rect"/>
+                  </pic:spPr>
+                </pic:pic>
+              </a:graphicData>
+            </a:graphic>
+          </wp:inline>
+        </w:drawing>
+      </w:r>
+    </w:p>
+    <w:p>
+      <w:r>
+        <w:rPr>
+          <w:i/>
+        </w:rPr>
+        <w:t>Files Matched modal — implementation reference</w:t>
+      </w:r>
+    </w:p>
+    <w:p>
+      <w:r>
+        <w:drawing>
+          <wp:inline xmlns:a="http://schemas.openxmlformats.org/drawingml/2006/main" xmlns:pic="http://schemas.openxmlformats.org/drawingml/2006/picture">
+            <wp:extent cx="5486400" cy="2185988"/>
+            <wp:docPr id="5" name="Picture 5"/>
+            <wp:cNvGraphicFramePr>
+              <a:graphicFrameLocks noChangeAspect="1"/>
+            </wp:cNvGraphicFramePr>
+            <a:graphic>
+              <a:graphicData uri="http://schemas.openxmlformats.org/drawingml/2006/picture">
+                <pic:pic>
+                  <pic:nvPicPr>
+                    <pic:cNvPr id="0" name="figma-08-upload-files-matched.png"/>
+                    <pic:cNvPicPr/>
+                  </pic:nvPicPr>
+                  <pic:blipFill>
+                    <a:blip r:embed="rId13"/>
+                    <a:stretch>
+                      <a:fillRect/>
+                    </a:stretch>
+                  </pic:blipFill>
+                  <pic:spPr>
+                    <a:xfrm>
+                      <a:off x="0" y="0"/>
+                      <a:ext cx="5486400" cy="2185988"/>
+                    </a:xfrm>
+                    <a:prstGeom prst="rect"/>
+                  </pic:spPr>
+                </pic:pic>
+              </a:graphicData>
+            </a:graphic>
+          </wp:inline>
+        </w:drawing>
+      </w:r>
+    </w:p>
+    <w:p>
+      <w:r>
+        <w:rPr>
+          <w:i/>
+        </w:rPr>
+        <w:t>Audit Complete modal and Issues Dashboard — implementation reference</w:t>
+      </w:r>
+    </w:p>
+    <w:p>
+      <w:r>
+        <w:drawing>
+          <wp:inline xmlns:a="http://schemas.openxmlformats.org/drawingml/2006/main" xmlns:pic="http://schemas.openxmlformats.org/drawingml/2006/picture">
+            <wp:extent cx="5486400" cy="7109595"/>
+            <wp:docPr id="6" name="Picture 6"/>
+            <wp:cNvGraphicFramePr>
+              <a:graphicFrameLocks noChangeAspect="1"/>
+            </wp:cNvGraphicFramePr>
+            <a:graphic>
+              <a:graphicData uri="http://schemas.openxmlformats.org/drawingml/2006/picture">
+                <pic:pic>
+                  <pic:nvPicPr>
+                    <pic:cNvPr id="0" name="figma-05-audit-complete-dashboard.png"/>
+                    <pic:cNvPicPr/>
+                  </pic:nvPicPr>
+                  <pic:blipFill>
+                    <a:blip r:embed="rId14"/>
+                    <a:stretch>
+                      <a:fillRect/>
+                    </a:stretch>
+                  </pic:blipFill>
+                  <pic:spPr>
+                    <a:xfrm>
+                      <a:off x="0" y="0"/>
+                      <a:ext cx="5486400" cy="7109595"/>
+                    </a:xfrm>
+                    <a:prstGeom prst="rect"/>
+                  </pic:spPr>
+                </pic:pic>
+              </a:graphicData>
+            </a:graphic>
+          </wp:inline>
+        </w:drawing>
+      </w:r>
+    </w:p>
+    <w:p>
+      <w:r>
+        <w:rPr>
+          <w:i/>
+        </w:rPr>
+        <w:t>Issue Detail drawer and Audit Report — implementation reference</w:t>
+      </w:r>
+    </w:p>
+    <w:p>
+      <w:r>
+        <w:drawing>
+          <wp:inline xmlns:a="http://schemas.openxmlformats.org/drawingml/2006/main" xmlns:pic="http://schemas.openxmlformats.org/drawingml/2006/picture">
+            <wp:extent cx="5486400" cy="6115507"/>
+            <wp:docPr id="7" name="Picture 7"/>
+            <wp:cNvGraphicFramePr>
+              <a:graphicFrameLocks noChangeAspect="1"/>
+            </wp:cNvGraphicFramePr>
+            <a:graphic>
+              <a:graphicData uri="http://schemas.openxmlformats.org/drawingml/2006/picture">
+                <pic:pic>
+                  <pic:nvPicPr>
+                    <pic:cNvPr id="0" name="figma-06-dashboard-detail-report.png"/>
+                    <pic:cNvPicPr/>
+                  </pic:nvPicPr>
+                  <pic:blipFill>
+                    <a:blip r:embed="rId15"/>
+                    <a:stretch>
+                      <a:fillRect/>
+                    </a:stretch>
+                  </pic:blipFill>
+                  <pic:spPr>
+                    <a:xfrm>
+                      <a:off x="0" y="0"/>
+                      <a:ext cx="5486400" cy="6115507"/>
+                    </a:xfrm>
+                    <a:prstGeom prst="rect"/>
+                  </pic:spPr>
+                </pic:pic>
+              </a:graphicData>
+            </a:graphic>
+          </wp:inline>
+        </w:drawing>
+      </w:r>
+    </w:p>
+    <w:p>
+      <w:r>
+        <w:rPr>
+          <w:i/>
+        </w:rPr>
+        <w:t>Generate Report modal and PDF layout — implementation reference</w:t>
+      </w:r>
+    </w:p>
+    <w:p>
+      <w:r>
+        <w:drawing>
+          <wp:inline xmlns:a="http://schemas.openxmlformats.org/drawingml/2006/main" xmlns:pic="http://schemas.openxmlformats.org/drawingml/2006/picture">
+            <wp:extent cx="5486400" cy="5924251"/>
+            <wp:docPr id="8" name="Picture 8"/>
+            <wp:cNvGraphicFramePr>
+              <a:graphicFrameLocks noChangeAspect="1"/>
+            </wp:cNvGraphicFramePr>
+            <a:graphic>
+              <a:graphicData uri="http://schemas.openxmlformats.org/drawingml/2006/picture">
+                <pic:pic>
+                  <pic:nvPicPr>
+                    <pic:cNvPr id="0" name="figma-07-generate-report-modal-pdf.png"/>
+                    <pic:cNvPicPr/>
+                  </pic:nvPicPr>
+                  <pic:blipFill>
+                    <a:blip r:embed="rId16"/>
+                    <a:stretch>
+                      <a:fillRect/>
+                    </a:stretch>
+                  </pic:blipFill>
+                  <pic:spPr>
+                    <a:xfrm>
+                      <a:off x="0" y="0"/>
+                      <a:ext cx="5486400" cy="5924251"/>
+                    </a:xfrm>
+                    <a:prstGeom prst="rect"/>
+                  </pic:spPr>
+                </pic:pic>
+              </a:graphicData>
+            </a:graphic>
+          </wp:inline>
+        </w:drawing>
       </w:r>
     </w:p>
     <w:p>

</xml_diff>